<commit_message>
perbaikan style button dan penambahan fitur dan halaman photobooth
</commit_message>
<xml_diff>
--- a/public/MyCV.docx
+++ b/public/MyCV.docx
@@ -65,27 +65,7 @@
           <w:szCs w:val="20"/>
           <w:lang w:val="id-ID"/>
         </w:rPr>
-        <w:t>linkedin.com/in/i-</w:t>
-      </w:r>
-      <w:proofErr w:type="spellStart"/>
-      <w:r>
-        <w:rPr>
-          <w:rFonts w:ascii="Arial" w:hAnsi="Arial" w:cs="Arial"/>
-          <w:sz w:val="20"/>
-          <w:szCs w:val="20"/>
-          <w:lang w:val="id-ID"/>
-        </w:rPr>
-        <w:t>kadek</w:t>
-      </w:r>
-      <w:proofErr w:type="spellEnd"/>
-      <w:r>
-        <w:rPr>
-          <w:rFonts w:ascii="Arial" w:hAnsi="Arial" w:cs="Arial"/>
-          <w:sz w:val="20"/>
-          <w:szCs w:val="20"/>
-          <w:lang w:val="id-ID"/>
-        </w:rPr>
-        <w:t>-mario-prayoga/</w:t>
+        <w:t>linkedin.com/in/i-kadek-mario-prayoga/</w:t>
       </w:r>
     </w:p>
     <w:p>
@@ -124,156 +104,19 @@
         </w:rPr>
         <w:t xml:space="preserve">Mahasiswa Informatika dari </w:t>
       </w:r>
-      <w:proofErr w:type="spellStart"/>
       <w:r>
         <w:rPr>
           <w:rFonts w:ascii="Arial" w:hAnsi="Arial" w:cs="Arial"/>
           <w:lang w:val="id-ID"/>
         </w:rPr>
-        <w:t>Primakara</w:t>
-      </w:r>
-      <w:proofErr w:type="spellEnd"/>
-      <w:r>
-        <w:rPr>
-          <w:rFonts w:ascii="Arial" w:hAnsi="Arial" w:cs="Arial"/>
-          <w:lang w:val="id-ID"/>
-        </w:rPr>
-        <w:t xml:space="preserve"> </w:t>
-      </w:r>
-      <w:proofErr w:type="spellStart"/>
-      <w:r>
-        <w:rPr>
-          <w:rFonts w:ascii="Arial" w:hAnsi="Arial" w:cs="Arial"/>
-          <w:lang w:val="id-ID"/>
-        </w:rPr>
-        <w:t>University</w:t>
-      </w:r>
-      <w:proofErr w:type="spellEnd"/>
-      <w:r>
-        <w:rPr>
-          <w:rFonts w:ascii="Arial" w:hAnsi="Arial" w:cs="Arial"/>
-          <w:lang w:val="id-ID"/>
-        </w:rPr>
-        <w:t xml:space="preserve"> </w:t>
+        <w:t xml:space="preserve">Primakara University </w:t>
       </w:r>
       <w:r>
         <w:rPr>
           <w:rFonts w:ascii="Arial" w:hAnsi="Arial" w:cs="Arial"/>
           <w:lang w:val="id-ID"/>
         </w:rPr>
-        <w:t xml:space="preserve">yang tertarik dalam pengembangan </w:t>
-      </w:r>
-      <w:proofErr w:type="spellStart"/>
-      <w:r>
-        <w:rPr>
-          <w:rFonts w:ascii="Arial" w:hAnsi="Arial" w:cs="Arial"/>
-          <w:lang w:val="id-ID"/>
-        </w:rPr>
-        <w:t>website</w:t>
-      </w:r>
-      <w:proofErr w:type="spellEnd"/>
-      <w:r>
-        <w:rPr>
-          <w:rFonts w:ascii="Arial" w:hAnsi="Arial" w:cs="Arial"/>
-          <w:lang w:val="id-ID"/>
-        </w:rPr>
-        <w:t xml:space="preserve">, khususnya di bidang </w:t>
-      </w:r>
-      <w:proofErr w:type="spellStart"/>
-      <w:r>
-        <w:rPr>
-          <w:rFonts w:ascii="Arial" w:hAnsi="Arial" w:cs="Arial"/>
-          <w:lang w:val="id-ID"/>
-        </w:rPr>
-        <w:t>frontend</w:t>
-      </w:r>
-      <w:proofErr w:type="spellEnd"/>
-      <w:r>
-        <w:rPr>
-          <w:rFonts w:ascii="Arial" w:hAnsi="Arial" w:cs="Arial"/>
-          <w:lang w:val="id-ID"/>
-        </w:rPr>
-        <w:t xml:space="preserve"> dan integrasi </w:t>
-      </w:r>
-      <w:proofErr w:type="spellStart"/>
-      <w:r>
-        <w:rPr>
-          <w:rFonts w:ascii="Arial" w:hAnsi="Arial" w:cs="Arial"/>
-          <w:lang w:val="id-ID"/>
-        </w:rPr>
-        <w:t>backend</w:t>
-      </w:r>
-      <w:proofErr w:type="spellEnd"/>
-      <w:r>
-        <w:rPr>
-          <w:rFonts w:ascii="Arial" w:hAnsi="Arial" w:cs="Arial"/>
-          <w:lang w:val="id-ID"/>
-        </w:rPr>
-        <w:t xml:space="preserve">. Sedang mendalami teknologi modern seperti Next.js dan </w:t>
-      </w:r>
-      <w:proofErr w:type="spellStart"/>
-      <w:r>
-        <w:rPr>
-          <w:rFonts w:ascii="Arial" w:hAnsi="Arial" w:cs="Arial"/>
-          <w:lang w:val="id-ID"/>
-        </w:rPr>
-        <w:t>Supabase</w:t>
-      </w:r>
-      <w:proofErr w:type="spellEnd"/>
-      <w:r>
-        <w:rPr>
-          <w:rFonts w:ascii="Arial" w:hAnsi="Arial" w:cs="Arial"/>
-          <w:lang w:val="id-ID"/>
-        </w:rPr>
-        <w:t xml:space="preserve"> melalui proyek mandiri, seperti </w:t>
-      </w:r>
-      <w:proofErr w:type="spellStart"/>
-      <w:r>
-        <w:rPr>
-          <w:rFonts w:ascii="Arial" w:hAnsi="Arial" w:cs="Arial"/>
-          <w:lang w:val="id-ID"/>
-        </w:rPr>
-        <w:t>landing</w:t>
-      </w:r>
-      <w:proofErr w:type="spellEnd"/>
-      <w:r>
-        <w:rPr>
-          <w:rFonts w:ascii="Arial" w:hAnsi="Arial" w:cs="Arial"/>
-          <w:lang w:val="id-ID"/>
-        </w:rPr>
-        <w:t xml:space="preserve"> </w:t>
-      </w:r>
-      <w:proofErr w:type="spellStart"/>
-      <w:r>
-        <w:rPr>
-          <w:rFonts w:ascii="Arial" w:hAnsi="Arial" w:cs="Arial"/>
-          <w:lang w:val="id-ID"/>
-        </w:rPr>
-        <w:t>page</w:t>
-      </w:r>
-      <w:proofErr w:type="spellEnd"/>
-      <w:r>
-        <w:rPr>
-          <w:rFonts w:ascii="Arial" w:hAnsi="Arial" w:cs="Arial"/>
-          <w:lang w:val="id-ID"/>
-        </w:rPr>
-        <w:t xml:space="preserve"> untuk UMKM dan </w:t>
-      </w:r>
-      <w:proofErr w:type="spellStart"/>
-      <w:r>
-        <w:rPr>
-          <w:rFonts w:ascii="Arial" w:hAnsi="Arial" w:cs="Arial"/>
-          <w:lang w:val="id-ID"/>
-        </w:rPr>
-        <w:t>website</w:t>
-      </w:r>
-      <w:proofErr w:type="spellEnd"/>
-      <w:r>
-        <w:rPr>
-          <w:rFonts w:ascii="Arial" w:hAnsi="Arial" w:cs="Arial"/>
-          <w:lang w:val="id-ID"/>
-        </w:rPr>
-        <w:t xml:space="preserve"> organisasi kepemudaan.</w:t>
+        <w:t>yang tertarik dalam pengembangan website, khususnya di bidang frontend dan integrasi backend. Sedang mendalami teknologi modern seperti Next.js dan Supabase melalui proyek mandiri, seperti landing page untuk UMKM dan website organisasi kepemudaan.</w:t>
       </w:r>
       <w:r>
         <w:rPr>
@@ -319,52 +162,34 @@
           <w:lang w:val="id-ID"/>
         </w:rPr>
       </w:pPr>
-      <w:proofErr w:type="spellStart"/>
       <w:r>
         <w:rPr>
           <w:rFonts w:ascii="Arial" w:hAnsi="Arial" w:cs="Arial"/>
           <w:lang w:val="id-ID"/>
         </w:rPr>
-        <w:t>Primakara</w:t>
+        <w:t>Primakara University</w:t>
       </w:r>
-      <w:proofErr w:type="spellEnd"/>
-      <w:r>
-        <w:rPr>
-          <w:rFonts w:ascii="Arial" w:hAnsi="Arial" w:cs="Arial"/>
-          <w:lang w:val="id-ID"/>
-        </w:rPr>
-        <w:t xml:space="preserve"> </w:t>
-      </w:r>
-      <w:proofErr w:type="spellStart"/>
-      <w:r>
-        <w:rPr>
-          <w:rFonts w:ascii="Arial" w:hAnsi="Arial" w:cs="Arial"/>
-          <w:lang w:val="id-ID"/>
-        </w:rPr>
-        <w:t>University</w:t>
-      </w:r>
-      <w:proofErr w:type="spellEnd"/>
       <w:r>
         <w:rPr>
           <w:rFonts w:ascii="Arial" w:hAnsi="Arial" w:cs="Arial"/>
           <w:lang w:val="id-ID"/>
         </w:rPr>
         <w:br/>
-        <w:t>S1 Informatika | IPK: 3.</w:t>
+        <w:t xml:space="preserve">S1 Informatika | IPK: </w:t>
       </w:r>
       <w:r>
         <w:rPr>
           <w:rFonts w:ascii="Arial" w:hAnsi="Arial" w:cs="Arial"/>
           <w:lang w:val="id-ID"/>
         </w:rPr>
-        <w:t>80</w:t>
+        <w:t>3.83</w:t>
       </w:r>
       <w:r>
         <w:rPr>
           <w:rFonts w:ascii="Arial" w:hAnsi="Arial" w:cs="Arial"/>
           <w:lang w:val="id-ID"/>
         </w:rPr>
-        <w:t xml:space="preserve"> / 4.00</w:t>
+        <w:t>/ 4.00</w:t>
       </w:r>
       <w:r>
         <w:rPr>
@@ -412,47 +237,7 @@
           <w:bCs/>
           <w:lang w:val="id-ID"/>
         </w:rPr>
-        <w:t xml:space="preserve">Landing </w:t>
-      </w:r>
-      <w:proofErr w:type="spellStart"/>
-      <w:r>
-        <w:rPr>
-          <w:rFonts w:ascii="Arial" w:hAnsi="Arial" w:cs="Arial"/>
-          <w:b/>
-          <w:bCs/>
-          <w:lang w:val="id-ID"/>
-        </w:rPr>
-        <w:t>Page</w:t>
-      </w:r>
-      <w:proofErr w:type="spellEnd"/>
-      <w:r>
-        <w:rPr>
-          <w:rFonts w:ascii="Arial" w:hAnsi="Arial" w:cs="Arial"/>
-          <w:b/>
-          <w:bCs/>
-          <w:lang w:val="id-ID"/>
-        </w:rPr>
-        <w:t xml:space="preserve"> Warung </w:t>
-      </w:r>
-      <w:proofErr w:type="spellStart"/>
-      <w:r>
-        <w:rPr>
-          <w:rFonts w:ascii="Arial" w:hAnsi="Arial" w:cs="Arial"/>
-          <w:b/>
-          <w:bCs/>
-          <w:lang w:val="id-ID"/>
-        </w:rPr>
-        <w:t>Mennara</w:t>
-      </w:r>
-      <w:proofErr w:type="spellEnd"/>
-      <w:r>
-        <w:rPr>
-          <w:rFonts w:ascii="Arial" w:hAnsi="Arial" w:cs="Arial"/>
-          <w:b/>
-          <w:bCs/>
-          <w:lang w:val="id-ID"/>
-        </w:rPr>
-        <w:t xml:space="preserve"> (Juni 2025)</w:t>
+        <w:t>Landing Page Warung Mennara (Juni 2025)</w:t>
       </w:r>
     </w:p>
     <w:p>
@@ -474,71 +259,7 @@
           <w:rFonts w:ascii="Arial" w:hAnsi="Arial" w:cs="Arial"/>
           <w:lang w:val="id-ID"/>
         </w:rPr>
-        <w:t xml:space="preserve">Sebuah </w:t>
-      </w:r>
-      <w:proofErr w:type="spellStart"/>
-      <w:r>
-        <w:rPr>
-          <w:rFonts w:ascii="Arial" w:hAnsi="Arial" w:cs="Arial"/>
-          <w:lang w:val="id-ID"/>
-        </w:rPr>
-        <w:t>landing</w:t>
-      </w:r>
-      <w:proofErr w:type="spellEnd"/>
-      <w:r>
-        <w:rPr>
-          <w:rFonts w:ascii="Arial" w:hAnsi="Arial" w:cs="Arial"/>
-          <w:lang w:val="id-ID"/>
-        </w:rPr>
-        <w:t xml:space="preserve"> </w:t>
-      </w:r>
-      <w:proofErr w:type="spellStart"/>
-      <w:r>
-        <w:rPr>
-          <w:rFonts w:ascii="Arial" w:hAnsi="Arial" w:cs="Arial"/>
-          <w:lang w:val="id-ID"/>
-        </w:rPr>
-        <w:t>page</w:t>
-      </w:r>
-      <w:proofErr w:type="spellEnd"/>
-      <w:r>
-        <w:rPr>
-          <w:rFonts w:ascii="Arial" w:hAnsi="Arial" w:cs="Arial"/>
-          <w:lang w:val="id-ID"/>
-        </w:rPr>
-        <w:t xml:space="preserve"> statis untuk promosi UMKM </w:t>
-      </w:r>
-      <w:proofErr w:type="spellStart"/>
-      <w:r>
-        <w:rPr>
-          <w:rFonts w:ascii="Arial" w:hAnsi="Arial" w:cs="Arial"/>
-          <w:lang w:val="id-ID"/>
-        </w:rPr>
-        <w:t>frozen</w:t>
-      </w:r>
-      <w:proofErr w:type="spellEnd"/>
-      <w:r>
-        <w:rPr>
-          <w:rFonts w:ascii="Arial" w:hAnsi="Arial" w:cs="Arial"/>
-          <w:lang w:val="id-ID"/>
-        </w:rPr>
-        <w:t xml:space="preserve"> </w:t>
-      </w:r>
-      <w:proofErr w:type="spellStart"/>
-      <w:r>
-        <w:rPr>
-          <w:rFonts w:ascii="Arial" w:hAnsi="Arial" w:cs="Arial"/>
-          <w:lang w:val="id-ID"/>
-        </w:rPr>
-        <w:t>food</w:t>
-      </w:r>
-      <w:proofErr w:type="spellEnd"/>
-      <w:r>
-        <w:rPr>
-          <w:rFonts w:ascii="Arial" w:hAnsi="Arial" w:cs="Arial"/>
-          <w:lang w:val="id-ID"/>
-        </w:rPr>
-        <w:t>.</w:t>
+        <w:t>Sebuah landing page statis untuk promosi UMKM frozen food.</w:t>
       </w:r>
     </w:p>
     <w:p>
@@ -582,23 +303,7 @@
           <w:rFonts w:ascii="Arial" w:hAnsi="Arial" w:cs="Arial"/>
           <w:lang w:val="id-ID"/>
         </w:rPr>
-        <w:t xml:space="preserve">Menampilkan informasi produk, kontak </w:t>
-      </w:r>
-      <w:proofErr w:type="spellStart"/>
-      <w:r>
-        <w:rPr>
-          <w:rFonts w:ascii="Arial" w:hAnsi="Arial" w:cs="Arial"/>
-          <w:lang w:val="id-ID"/>
-        </w:rPr>
-        <w:t>WhatsApp</w:t>
-      </w:r>
-      <w:proofErr w:type="spellEnd"/>
-      <w:r>
-        <w:rPr>
-          <w:rFonts w:ascii="Arial" w:hAnsi="Arial" w:cs="Arial"/>
-          <w:lang w:val="id-ID"/>
-        </w:rPr>
-        <w:t>, dan profil usaha.</w:t>
+        <w:t>Menampilkan informasi produk, kontak WhatsApp, dan profil usaha.</w:t>
       </w:r>
     </w:p>
     <w:p>
@@ -620,39 +325,7 @@
           <w:rFonts w:ascii="Arial" w:hAnsi="Arial" w:cs="Arial"/>
           <w:lang w:val="id-ID"/>
         </w:rPr>
-        <w:t xml:space="preserve">Proyek ini dipublikasikan di platform </w:t>
-      </w:r>
-      <w:proofErr w:type="spellStart"/>
-      <w:r>
-        <w:rPr>
-          <w:rFonts w:ascii="Arial" w:hAnsi="Arial" w:cs="Arial"/>
-          <w:lang w:val="id-ID"/>
-        </w:rPr>
-        <w:t>hosting</w:t>
-      </w:r>
-      <w:proofErr w:type="spellEnd"/>
-      <w:r>
-        <w:rPr>
-          <w:rFonts w:ascii="Arial" w:hAnsi="Arial" w:cs="Arial"/>
-          <w:lang w:val="id-ID"/>
-        </w:rPr>
-        <w:t xml:space="preserve"> statis untuk kebutuhan real-</w:t>
-      </w:r>
-      <w:proofErr w:type="spellStart"/>
-      <w:r>
-        <w:rPr>
-          <w:rFonts w:ascii="Arial" w:hAnsi="Arial" w:cs="Arial"/>
-          <w:lang w:val="id-ID"/>
-        </w:rPr>
-        <w:t>life</w:t>
-      </w:r>
-      <w:proofErr w:type="spellEnd"/>
-      <w:r>
-        <w:rPr>
-          <w:rFonts w:ascii="Arial" w:hAnsi="Arial" w:cs="Arial"/>
-          <w:lang w:val="id-ID"/>
-        </w:rPr>
-        <w:t>.</w:t>
+        <w:t>Proyek ini dipublikasikan di platform hosting statis untuk kebutuhan real-life.</w:t>
       </w:r>
       <w:r>
         <w:rPr>
@@ -672,7 +345,6 @@
           <w:lang w:val="id-ID"/>
         </w:rPr>
       </w:pPr>
-      <w:proofErr w:type="spellStart"/>
       <w:r>
         <w:rPr>
           <w:rFonts w:ascii="Arial" w:hAnsi="Arial" w:cs="Arial"/>
@@ -680,37 +352,7 @@
           <w:bCs/>
           <w:lang w:val="id-ID"/>
         </w:rPr>
-        <w:t>Website</w:t>
-      </w:r>
-      <w:proofErr w:type="spellEnd"/>
-      <w:r>
-        <w:rPr>
-          <w:rFonts w:ascii="Arial" w:hAnsi="Arial" w:cs="Arial"/>
-          <w:b/>
-          <w:bCs/>
-          <w:lang w:val="id-ID"/>
-        </w:rPr>
-        <w:t xml:space="preserve"> Organisasi Pemuda </w:t>
-      </w:r>
-      <w:proofErr w:type="spellStart"/>
-      <w:r>
-        <w:rPr>
-          <w:rFonts w:ascii="Arial" w:hAnsi="Arial" w:cs="Arial"/>
-          <w:b/>
-          <w:bCs/>
-          <w:lang w:val="id-ID"/>
-        </w:rPr>
-        <w:t>Brasika</w:t>
-      </w:r>
-      <w:proofErr w:type="spellEnd"/>
-      <w:r>
-        <w:rPr>
-          <w:rFonts w:ascii="Arial" w:hAnsi="Arial" w:cs="Arial"/>
-          <w:b/>
-          <w:bCs/>
-          <w:lang w:val="id-ID"/>
-        </w:rPr>
-        <w:t xml:space="preserve"> Asta Dharma I (Mei 2025)</w:t>
+        <w:t>Website Organisasi Pemuda Brasika Asta Dharma I (Mei 2025)</w:t>
       </w:r>
     </w:p>
     <w:p>
@@ -725,23 +367,13 @@
           <w:lang w:val="id-ID"/>
         </w:rPr>
       </w:pPr>
-      <w:proofErr w:type="spellStart"/>
       <w:r>
         <w:rPr>
           <w:rFonts w:ascii="Arial" w:hAnsi="Arial" w:cs="Arial"/>
           <w:lang w:val="id-ID"/>
         </w:rPr>
-        <w:t>Website</w:t>
+        <w:t xml:space="preserve">Website organisasi kepemudaan berbasis Next.js dan </w:t>
       </w:r>
-      <w:proofErr w:type="spellEnd"/>
-      <w:r>
-        <w:rPr>
-          <w:rFonts w:ascii="Arial" w:hAnsi="Arial" w:cs="Arial"/>
-          <w:lang w:val="id-ID"/>
-        </w:rPr>
-        <w:t xml:space="preserve"> organisasi kepemudaan berbasis Next.js dan </w:t>
-      </w:r>
-      <w:proofErr w:type="spellStart"/>
       <w:r>
         <w:rPr>
           <w:rFonts w:ascii="Arial" w:hAnsi="Arial" w:cs="Arial"/>
@@ -749,7 +381,6 @@
         </w:rPr>
         <w:t>Tailwind</w:t>
       </w:r>
-      <w:proofErr w:type="spellEnd"/>
       <w:r>
         <w:rPr>
           <w:rFonts w:ascii="Arial" w:hAnsi="Arial" w:cs="Arial"/>
@@ -874,53 +505,7 @@
           <w:rFonts w:ascii="Arial" w:hAnsi="Arial" w:cs="Arial"/>
           <w:lang w:val="id-ID"/>
         </w:rPr>
-        <w:t>BPSDMP Yogyakarta</w:t>
-      </w:r>
-      <w:r>
-        <w:rPr>
-          <w:rFonts w:ascii="Arial" w:hAnsi="Arial" w:cs="Arial"/>
-          <w:lang w:val="id-ID"/>
-        </w:rPr>
-        <w:t xml:space="preserve"> </w:t>
-      </w:r>
-      <w:r>
-        <w:rPr>
-          <w:rFonts w:ascii="Arial" w:hAnsi="Arial" w:cs="Arial"/>
-          <w:lang w:val="id-ID"/>
-        </w:rPr>
-        <w:t xml:space="preserve">– VSGA Digital </w:t>
-      </w:r>
-      <w:proofErr w:type="spellStart"/>
-      <w:r>
-        <w:rPr>
-          <w:rFonts w:ascii="Arial" w:hAnsi="Arial" w:cs="Arial"/>
-          <w:lang w:val="id-ID"/>
-        </w:rPr>
-        <w:t>Talent</w:t>
-      </w:r>
-      <w:proofErr w:type="spellEnd"/>
-      <w:r>
-        <w:rPr>
-          <w:rFonts w:ascii="Arial" w:hAnsi="Arial" w:cs="Arial"/>
-          <w:lang w:val="id-ID"/>
-        </w:rPr>
-        <w:t xml:space="preserve"> </w:t>
-      </w:r>
-      <w:proofErr w:type="spellStart"/>
-      <w:r>
-        <w:rPr>
-          <w:rFonts w:ascii="Arial" w:hAnsi="Arial" w:cs="Arial"/>
-          <w:lang w:val="id-ID"/>
-        </w:rPr>
-        <w:t>Scholarship</w:t>
-      </w:r>
-      <w:proofErr w:type="spellEnd"/>
-      <w:r>
-        <w:rPr>
-          <w:rFonts w:ascii="Arial" w:hAnsi="Arial" w:cs="Arial"/>
-          <w:lang w:val="id-ID"/>
-        </w:rPr>
-        <w:t xml:space="preserve"> </w:t>
+        <w:t xml:space="preserve">BPSDMP Yogyakarta – VSGA Digital Talent Scholarship </w:t>
       </w:r>
       <w:r>
         <w:rPr>
@@ -976,76 +561,7 @@
           <w:rFonts w:ascii="Arial" w:hAnsi="Arial" w:cs="Arial"/>
           <w:lang w:val="id-ID"/>
         </w:rPr>
-        <w:t xml:space="preserve"> </w:t>
-      </w:r>
-      <w:r>
-        <w:rPr>
-          <w:rFonts w:ascii="Arial" w:hAnsi="Arial" w:cs="Arial"/>
-          <w:lang w:val="id-ID"/>
-        </w:rPr>
-        <w:t xml:space="preserve">HTML, CSS, </w:t>
-      </w:r>
-      <w:r>
-        <w:rPr>
-          <w:rFonts w:ascii="Arial" w:hAnsi="Arial" w:cs="Arial"/>
-          <w:lang w:val="id-ID"/>
-        </w:rPr>
-        <w:t>PHP</w:t>
-      </w:r>
-      <w:r>
-        <w:rPr>
-          <w:rFonts w:ascii="Arial" w:hAnsi="Arial" w:cs="Arial"/>
-          <w:lang w:val="id-ID"/>
-        </w:rPr>
-        <w:t xml:space="preserve">, Implementasi UI, Pemrograman Terstruktur, Best </w:t>
-      </w:r>
-      <w:proofErr w:type="spellStart"/>
-      <w:r>
-        <w:rPr>
-          <w:rFonts w:ascii="Arial" w:hAnsi="Arial" w:cs="Arial"/>
-          <w:lang w:val="id-ID"/>
-        </w:rPr>
-        <w:t>Practices</w:t>
-      </w:r>
-      <w:proofErr w:type="spellEnd"/>
-      <w:r>
-        <w:rPr>
-          <w:rFonts w:ascii="Arial" w:hAnsi="Arial" w:cs="Arial"/>
-          <w:lang w:val="id-ID"/>
-        </w:rPr>
-        <w:t xml:space="preserve">, </w:t>
-      </w:r>
-      <w:proofErr w:type="spellStart"/>
-      <w:r>
-        <w:rPr>
-          <w:rFonts w:ascii="Arial" w:hAnsi="Arial" w:cs="Arial"/>
-          <w:lang w:val="id-ID"/>
-        </w:rPr>
-        <w:t>Library</w:t>
-      </w:r>
-      <w:proofErr w:type="spellEnd"/>
-      <w:r>
-        <w:rPr>
-          <w:rFonts w:ascii="Arial" w:hAnsi="Arial" w:cs="Arial"/>
-          <w:lang w:val="id-ID"/>
-        </w:rPr>
-        <w:t>/</w:t>
-      </w:r>
-      <w:proofErr w:type="spellStart"/>
-      <w:r>
-        <w:rPr>
-          <w:rFonts w:ascii="Arial" w:hAnsi="Arial" w:cs="Arial"/>
-          <w:lang w:val="id-ID"/>
-        </w:rPr>
-        <w:t>Framework</w:t>
-      </w:r>
-      <w:proofErr w:type="spellEnd"/>
-      <w:r>
-        <w:rPr>
-          <w:rFonts w:ascii="Arial" w:hAnsi="Arial" w:cs="Arial"/>
-          <w:lang w:val="id-ID"/>
-        </w:rPr>
-        <w:t xml:space="preserve"> Dasar</w:t>
+        <w:t xml:space="preserve"> HTML, CSS, PHP, Implementasi UI, Pemrograman Terstruktur, Best Practices, Library/Framework Dasar</w:t>
       </w:r>
     </w:p>
     <w:p>
@@ -1060,23 +576,7 @@
           <w:rFonts w:ascii="Arial" w:hAnsi="Arial" w:cs="Arial"/>
           <w:lang w:val="id-ID"/>
         </w:rPr>
-        <w:t xml:space="preserve">- Web Development, </w:t>
-      </w:r>
-      <w:proofErr w:type="spellStart"/>
-      <w:r>
-        <w:rPr>
-          <w:rFonts w:ascii="Arial" w:hAnsi="Arial" w:cs="Arial"/>
-          <w:lang w:val="id-ID"/>
-        </w:rPr>
-        <w:t>MySkill</w:t>
-      </w:r>
-      <w:proofErr w:type="spellEnd"/>
-      <w:r>
-        <w:rPr>
-          <w:rFonts w:ascii="Arial" w:hAnsi="Arial" w:cs="Arial"/>
-          <w:lang w:val="id-ID"/>
-        </w:rPr>
-        <w:t xml:space="preserve"> (Juli 2025)</w:t>
+        <w:t>- Web Development, MySkill (Juli 2025)</w:t>
       </w:r>
       <w:r>
         <w:rPr>
@@ -1084,25 +584,8 @@
           <w:lang w:val="id-ID"/>
         </w:rPr>
         <w:br/>
-        <w:t xml:space="preserve">  Modul: HTML, CSS, </w:t>
+        <w:t xml:space="preserve">  Modul: HTML, CSS, JavaScript, </w:t>
       </w:r>
-      <w:proofErr w:type="spellStart"/>
-      <w:r>
-        <w:rPr>
-          <w:rFonts w:ascii="Arial" w:hAnsi="Arial" w:cs="Arial"/>
-          <w:lang w:val="id-ID"/>
-        </w:rPr>
-        <w:t>JavaScript</w:t>
-      </w:r>
-      <w:proofErr w:type="spellEnd"/>
-      <w:r>
-        <w:rPr>
-          <w:rFonts w:ascii="Arial" w:hAnsi="Arial" w:cs="Arial"/>
-          <w:lang w:val="id-ID"/>
-        </w:rPr>
-        <w:t xml:space="preserve">, </w:t>
-      </w:r>
-      <w:proofErr w:type="spellStart"/>
       <w:r>
         <w:rPr>
           <w:rFonts w:ascii="Arial" w:hAnsi="Arial" w:cs="Arial"/>
@@ -1110,71 +593,13 @@
         </w:rPr>
         <w:t>Git&amp;GitHub</w:t>
       </w:r>
-      <w:proofErr w:type="spellEnd"/>
       <w:r>
         <w:rPr>
           <w:rFonts w:ascii="Arial" w:hAnsi="Arial" w:cs="Arial"/>
           <w:lang w:val="id-ID"/>
         </w:rPr>
-        <w:t xml:space="preserve">, </w:t>
+        <w:t>, Responsive Design, Career Preparation, WordPress</w:t>
       </w:r>
-      <w:proofErr w:type="spellStart"/>
-      <w:r>
-        <w:rPr>
-          <w:rFonts w:ascii="Arial" w:hAnsi="Arial" w:cs="Arial"/>
-          <w:lang w:val="id-ID"/>
-        </w:rPr>
-        <w:t>Responsive</w:t>
-      </w:r>
-      <w:proofErr w:type="spellEnd"/>
-      <w:r>
-        <w:rPr>
-          <w:rFonts w:ascii="Arial" w:hAnsi="Arial" w:cs="Arial"/>
-          <w:lang w:val="id-ID"/>
-        </w:rPr>
-        <w:t xml:space="preserve"> Design, </w:t>
-      </w:r>
-      <w:proofErr w:type="spellStart"/>
-      <w:r>
-        <w:rPr>
-          <w:rFonts w:ascii="Arial" w:hAnsi="Arial" w:cs="Arial"/>
-          <w:lang w:val="id-ID"/>
-        </w:rPr>
-        <w:t>Career</w:t>
-      </w:r>
-      <w:proofErr w:type="spellEnd"/>
-      <w:r>
-        <w:rPr>
-          <w:rFonts w:ascii="Arial" w:hAnsi="Arial" w:cs="Arial"/>
-          <w:lang w:val="id-ID"/>
-        </w:rPr>
-        <w:t xml:space="preserve"> </w:t>
-      </w:r>
-      <w:proofErr w:type="spellStart"/>
-      <w:r>
-        <w:rPr>
-          <w:rFonts w:ascii="Arial" w:hAnsi="Arial" w:cs="Arial"/>
-          <w:lang w:val="id-ID"/>
-        </w:rPr>
-        <w:t>Preparation</w:t>
-      </w:r>
-      <w:proofErr w:type="spellEnd"/>
-      <w:r>
-        <w:rPr>
-          <w:rFonts w:ascii="Arial" w:hAnsi="Arial" w:cs="Arial"/>
-          <w:lang w:val="id-ID"/>
-        </w:rPr>
-        <w:t xml:space="preserve">, </w:t>
-      </w:r>
-      <w:proofErr w:type="spellStart"/>
-      <w:r>
-        <w:rPr>
-          <w:rFonts w:ascii="Arial" w:hAnsi="Arial" w:cs="Arial"/>
-          <w:lang w:val="id-ID"/>
-        </w:rPr>
-        <w:t>WordPress</w:t>
-      </w:r>
-      <w:proofErr w:type="spellEnd"/>
     </w:p>
     <w:p>
       <w:pPr>
@@ -1216,16 +641,15 @@
           <w:rFonts w:ascii="Arial" w:hAnsi="Arial" w:cs="Arial"/>
           <w:lang w:val="id-ID"/>
         </w:rPr>
-        <w:br/>
-        <w:t xml:space="preserve">Perangkat Lunak: VS Code, </w:t>
+        <w:t xml:space="preserve"> Basic</w:t>
       </w:r>
-      <w:proofErr w:type="spellStart"/>
       <w:r>
         <w:rPr>
           <w:rFonts w:ascii="Arial" w:hAnsi="Arial" w:cs="Arial"/>
           <w:lang w:val="id-ID"/>
         </w:rPr>
-        <w:t>Git</w:t>
+        <w:br/>
+        <w:t>Perangkat Lunak: VS Code, Git</w:t>
       </w:r>
       <w:r>
         <w:rPr>
@@ -1234,94 +658,34 @@
         </w:rPr>
         <w:t>&amp;GitHub</w:t>
       </w:r>
-      <w:proofErr w:type="spellEnd"/>
       <w:r>
         <w:rPr>
           <w:rFonts w:ascii="Arial" w:hAnsi="Arial" w:cs="Arial"/>
           <w:lang w:val="id-ID"/>
         </w:rPr>
-        <w:t xml:space="preserve">, </w:t>
-      </w:r>
-      <w:proofErr w:type="spellStart"/>
-      <w:r>
-        <w:rPr>
-          <w:rFonts w:ascii="Arial" w:hAnsi="Arial" w:cs="Arial"/>
-          <w:lang w:val="id-ID"/>
-        </w:rPr>
-        <w:t>Figma</w:t>
-      </w:r>
-      <w:proofErr w:type="spellEnd"/>
-      <w:r>
-        <w:rPr>
-          <w:rFonts w:ascii="Arial" w:hAnsi="Arial" w:cs="Arial"/>
-          <w:lang w:val="id-ID"/>
-        </w:rPr>
-        <w:t xml:space="preserve">, </w:t>
-      </w:r>
-      <w:proofErr w:type="spellStart"/>
-      <w:r>
-        <w:rPr>
-          <w:rFonts w:ascii="Arial" w:hAnsi="Arial" w:cs="Arial"/>
-          <w:lang w:val="id-ID"/>
-        </w:rPr>
-        <w:t>Supabase</w:t>
-      </w:r>
-      <w:proofErr w:type="spellEnd"/>
-      <w:r>
-        <w:rPr>
-          <w:rFonts w:ascii="Arial" w:hAnsi="Arial" w:cs="Arial"/>
-          <w:lang w:val="id-ID"/>
-        </w:rPr>
-        <w:t>,</w:t>
+        <w:t>, Figma, Supabase,</w:t>
       </w:r>
       <w:r>
         <w:rPr>
           <w:rFonts w:ascii="Arial" w:hAnsi="Arial" w:cs="Arial"/>
           <w:lang w:val="id-ID"/>
         </w:rPr>
-        <w:t xml:space="preserve"> </w:t>
+        <w:t xml:space="preserve"> Laragon</w:t>
       </w:r>
-      <w:proofErr w:type="spellStart"/>
       <w:r>
         <w:rPr>
           <w:rFonts w:ascii="Arial" w:hAnsi="Arial" w:cs="Arial"/>
           <w:lang w:val="id-ID"/>
         </w:rPr>
-        <w:t>Laragon</w:t>
+        <w:t xml:space="preserve"> WordPress</w:t>
       </w:r>
-      <w:proofErr w:type="spellEnd"/>
       <w:r>
         <w:rPr>
           <w:rFonts w:ascii="Arial" w:hAnsi="Arial" w:cs="Arial"/>
           <w:lang w:val="id-ID"/>
         </w:rPr>
-        <w:t xml:space="preserve"> </w:t>
+        <w:t>, Canva</w:t>
       </w:r>
-      <w:proofErr w:type="spellStart"/>
-      <w:r>
-        <w:rPr>
-          <w:rFonts w:ascii="Arial" w:hAnsi="Arial" w:cs="Arial"/>
-          <w:lang w:val="id-ID"/>
-        </w:rPr>
-        <w:t>WordPress</w:t>
-      </w:r>
-      <w:proofErr w:type="spellEnd"/>
-      <w:r>
-        <w:rPr>
-          <w:rFonts w:ascii="Arial" w:hAnsi="Arial" w:cs="Arial"/>
-          <w:lang w:val="id-ID"/>
-        </w:rPr>
-        <w:t xml:space="preserve">, </w:t>
-      </w:r>
-      <w:proofErr w:type="spellStart"/>
-      <w:r>
-        <w:rPr>
-          <w:rFonts w:ascii="Arial" w:hAnsi="Arial" w:cs="Arial"/>
-          <w:lang w:val="id-ID"/>
-        </w:rPr>
-        <w:t>Canva</w:t>
-      </w:r>
-      <w:proofErr w:type="spellEnd"/>
       <w:r>
         <w:rPr>
           <w:rFonts w:ascii="Arial" w:hAnsi="Arial" w:cs="Arial"/>
@@ -1341,71 +705,22 @@
           <w:rFonts w:ascii="Arial" w:hAnsi="Arial" w:cs="Arial"/>
           <w:lang w:val="id-ID"/>
         </w:rPr>
-        <w:t xml:space="preserve">: HTML, CSS, </w:t>
-      </w:r>
-      <w:proofErr w:type="spellStart"/>
-      <w:r>
-        <w:rPr>
-          <w:rFonts w:ascii="Arial" w:hAnsi="Arial" w:cs="Arial"/>
-          <w:lang w:val="id-ID"/>
-        </w:rPr>
-        <w:t>JavaScript</w:t>
-      </w:r>
-      <w:proofErr w:type="spellEnd"/>
-      <w:r>
-        <w:rPr>
-          <w:rFonts w:ascii="Arial" w:hAnsi="Arial" w:cs="Arial"/>
-          <w:lang w:val="id-ID"/>
-        </w:rPr>
-        <w:t>,</w:t>
+        <w:t>: HTML, CSS, JavaScript,</w:t>
       </w:r>
       <w:r>
         <w:rPr>
           <w:rFonts w:ascii="Arial" w:hAnsi="Arial" w:cs="Arial"/>
           <w:lang w:val="id-ID"/>
         </w:rPr>
-        <w:t xml:space="preserve"> </w:t>
-      </w:r>
-      <w:proofErr w:type="spellStart"/>
-      <w:r>
-        <w:rPr>
-          <w:rFonts w:ascii="Arial" w:hAnsi="Arial" w:cs="Arial"/>
-          <w:lang w:val="id-ID"/>
-        </w:rPr>
-        <w:t>React</w:t>
-      </w:r>
-      <w:proofErr w:type="spellEnd"/>
-      <w:r>
-        <w:rPr>
-          <w:rFonts w:ascii="Arial" w:hAnsi="Arial" w:cs="Arial"/>
-          <w:lang w:val="id-ID"/>
-        </w:rPr>
-        <w:t>,</w:t>
+        <w:t xml:space="preserve"> React,</w:t>
       </w:r>
       <w:r>
         <w:rPr>
           <w:rFonts w:ascii="Arial" w:hAnsi="Arial" w:cs="Arial"/>
           <w:lang w:val="id-ID"/>
         </w:rPr>
-        <w:t xml:space="preserve"> Next.js, </w:t>
+        <w:t xml:space="preserve"> Next.js, Responsive Web Design, </w:t>
       </w:r>
-      <w:proofErr w:type="spellStart"/>
-      <w:r>
-        <w:rPr>
-          <w:rFonts w:ascii="Arial" w:hAnsi="Arial" w:cs="Arial"/>
-          <w:lang w:val="id-ID"/>
-        </w:rPr>
-        <w:t>Responsive</w:t>
-      </w:r>
-      <w:proofErr w:type="spellEnd"/>
-      <w:r>
-        <w:rPr>
-          <w:rFonts w:ascii="Arial" w:hAnsi="Arial" w:cs="Arial"/>
-          <w:lang w:val="id-ID"/>
-        </w:rPr>
-        <w:t xml:space="preserve"> Web Design, </w:t>
-      </w:r>
-      <w:proofErr w:type="spellStart"/>
       <w:r>
         <w:rPr>
           <w:rFonts w:ascii="Arial" w:hAnsi="Arial" w:cs="Arial"/>
@@ -1413,30 +728,13 @@
         </w:rPr>
         <w:t>Python</w:t>
       </w:r>
-      <w:proofErr w:type="spellEnd"/>
       <w:r>
         <w:rPr>
           <w:rFonts w:ascii="Arial" w:hAnsi="Arial" w:cs="Arial"/>
           <w:lang w:val="id-ID"/>
         </w:rPr>
         <w:br/>
-        <w:t xml:space="preserve">Produktivitas: Microsoft </w:t>
-      </w:r>
-      <w:proofErr w:type="spellStart"/>
-      <w:r>
-        <w:rPr>
-          <w:rFonts w:ascii="Arial" w:hAnsi="Arial" w:cs="Arial"/>
-          <w:lang w:val="id-ID"/>
-        </w:rPr>
-        <w:t>excel</w:t>
-      </w:r>
-      <w:proofErr w:type="spellEnd"/>
-      <w:r>
-        <w:rPr>
-          <w:rFonts w:ascii="Arial" w:hAnsi="Arial" w:cs="Arial"/>
-          <w:lang w:val="id-ID"/>
-        </w:rPr>
-        <w:t>, Word, PowerPoint</w:t>
+        <w:t>Produktivitas: Microsoft excel, Word, PowerPoint</w:t>
       </w:r>
     </w:p>
     <w:sectPr>

</xml_diff>